<commit_message>
docs: Nuevo sping backlog
</commit_message>
<xml_diff>
--- a/FASE 2/Evidencias Proyecto/Documentacion/Product Backlog.docx
+++ b/FASE 2/Evidencias Proyecto/Documentacion/Product Backlog.docx
@@ -348,7 +348,13 @@
     <w:sdt>
       <w:sdtPr>
         <w:rPr>
-          <w:rFonts w:ascii="Calibri" w:hAnsi="Calibri" w:cs="Calibri"/>
+          <w:rFonts w:ascii="Calibri" w:eastAsiaTheme="minorHAnsi" w:hAnsi="Calibri" w:cs="Calibri"/>
+          <w:color w:val="auto"/>
+          <w:kern w:val="2"/>
+          <w:sz w:val="24"/>
+          <w:szCs w:val="24"/>
+          <w:lang w:val="es-CL"/>
+          <w14:ligatures w14:val="standardContextual"/>
         </w:rPr>
         <w:id w:val="987367382"/>
         <w:docPartObj>
@@ -358,16 +364,9 @@
       </w:sdtPr>
       <w:sdtEndPr>
         <w:rPr>
-          <w:rFonts w:eastAsiaTheme="minorHAnsi"/>
           <w:b/>
           <w:bCs/>
           <w:noProof/>
-          <w:color w:val="auto"/>
-          <w:kern w:val="2"/>
-          <w:sz w:val="24"/>
-          <w:szCs w:val="24"/>
-          <w:lang w:val="es-CL"/>
-          <w14:ligatures w14:val="standardContextual"/>
         </w:rPr>
       </w:sdtEndPr>
       <w:sdtContent>
@@ -860,25 +859,7 @@
           <w:sz w:val="20"/>
           <w:szCs w:val="20"/>
         </w:rPr>
-        <w:t xml:space="preserve">El MVP se centra en el </w:t>
-      </w:r>
-      <w:r>
-        <w:rPr>
-          <w:rFonts w:ascii="Calibri" w:hAnsi="Calibri" w:cs="Calibri"/>
-          <w:b/>
-          <w:bCs/>
-          <w:sz w:val="20"/>
-          <w:szCs w:val="20"/>
-        </w:rPr>
-        <w:t>monitoreo de actividad, los avisos de uso prolongado, el control mediante gestos, el control mediante voz y la interfaz de usuario</w:t>
-      </w:r>
-      <w:r>
-        <w:rPr>
-          <w:rFonts w:ascii="Calibri" w:hAnsi="Calibri" w:cs="Calibri"/>
-          <w:sz w:val="20"/>
-          <w:szCs w:val="20"/>
-        </w:rPr>
-        <w:t>.</w:t>
+        <w:t>El MVP se centra en el monitoreo de actividad, los avisos de uso prolongado, el control mediante gestos, el control mediante voz y la interfaz de usuario.</w:t>
       </w:r>
     </w:p>
     <w:p>
@@ -6100,6 +6081,9 @@
       <w:pStyle w:val="Header"/>
     </w:pPr>
     <w:r>
+      <w:rPr>
+        <w:noProof/>
+      </w:rPr>
       <w:drawing>
         <wp:anchor distT="0" distB="0" distL="114300" distR="114300" simplePos="0" relativeHeight="251658240" behindDoc="0" locked="0" layoutInCell="1" allowOverlap="1" wp14:anchorId="4F02DA18" wp14:editId="6308BBEE">
           <wp:simplePos x="0" y="0"/>
@@ -6763,6 +6747,7 @@
   <w:style w:type="character" w:default="1" w:styleId="DefaultParagraphFont">
     <w:name w:val="Default Paragraph Font"/>
     <w:uiPriority w:val="1"/>
+    <w:semiHidden/>
     <w:unhideWhenUsed/>
   </w:style>
   <w:style w:type="table" w:default="1" w:styleId="TableNormal">

</xml_diff>

<commit_message>
docs: Se incorporan cuentas de usuario, servidor propio y referencias a la documentación
</commit_message>
<xml_diff>
--- a/FASE 2/Evidencias Proyecto/Documentacion/Product Backlog.docx
+++ b/FASE 2/Evidencias Proyecto/Documentacion/Product Backlog.docx
@@ -227,45 +227,9 @@
           <w:szCs w:val="20"/>
         </w:rPr>
         <w:t>Integrantes: Alejandro Silva</w:t>
-      </w:r>
-      <w:r>
-        <w:rPr>
-          <w:rFonts w:ascii="Calibri" w:hAnsi="Calibri" w:cs="Calibri"/>
-          <w:b/>
-          <w:bCs/>
-          <w:sz w:val="20"/>
-          <w:szCs w:val="20"/>
-        </w:rPr>
         <w:tab/>
-      </w:r>
-      <w:r>
-        <w:rPr>
-          <w:rFonts w:ascii="Calibri" w:hAnsi="Calibri" w:cs="Calibri"/>
-          <w:b/>
-          <w:bCs/>
-          <w:sz w:val="20"/>
-          <w:szCs w:val="20"/>
-        </w:rPr>
         <w:tab/>
-      </w:r>
-      <w:r>
-        <w:rPr>
-          <w:rFonts w:ascii="Calibri" w:hAnsi="Calibri" w:cs="Calibri"/>
-          <w:b/>
-          <w:bCs/>
-          <w:sz w:val="20"/>
-          <w:szCs w:val="20"/>
-        </w:rPr>
         <w:tab/>
-      </w:r>
-      <w:r>
-        <w:rPr>
-          <w:rFonts w:ascii="Calibri" w:hAnsi="Calibri" w:cs="Calibri"/>
-          <w:b/>
-          <w:bCs/>
-          <w:sz w:val="20"/>
-          <w:szCs w:val="20"/>
-        </w:rPr>
         <w:tab/>
         <w:t>Docente: Maria Cobo</w:t>
       </w:r>
@@ -364,17 +328,7 @@
               <w:rFonts w:ascii="Calibri" w:hAnsi="Calibri" w:cs="Calibri"/>
             </w:rPr>
             <w:fldChar w:fldCharType="begin"/>
-          </w:r>
-          <w:r>
-            <w:rPr>
-              <w:rFonts w:ascii="Calibri" w:hAnsi="Calibri" w:cs="Calibri"/>
-            </w:rPr>
             <w:instrText xml:space="preserve"> TOC \o "1-3" \h \z \u </w:instrText>
-          </w:r>
-          <w:r>
-            <w:rPr>
-              <w:rFonts w:ascii="Calibri" w:hAnsi="Calibri" w:cs="Calibri"/>
-            </w:rPr>
             <w:fldChar w:fldCharType="separate"/>
           </w:r>
           <w:hyperlink w:anchor="_Toc241874111" w:history="1">
@@ -392,46 +346,10 @@
                 <w:webHidden/>
               </w:rPr>
               <w:tab/>
-            </w:r>
-            <w:r>
-              <w:rPr>
-                <w:noProof/>
-                <w:webHidden/>
-              </w:rPr>
               <w:fldChar w:fldCharType="begin"/>
-            </w:r>
-            <w:r>
-              <w:rPr>
-                <w:noProof/>
-                <w:webHidden/>
-              </w:rPr>
               <w:instrText xml:space="preserve"> PAGEREF _Toc241874111 \h </w:instrText>
-            </w:r>
-            <w:r>
-              <w:rPr>
-                <w:noProof/>
-                <w:webHidden/>
-              </w:rPr>
-            </w:r>
-            <w:r>
-              <w:rPr>
-                <w:noProof/>
-                <w:webHidden/>
-              </w:rPr>
               <w:fldChar w:fldCharType="separate"/>
-            </w:r>
-            <w:r>
-              <w:rPr>
-                <w:noProof/>
-                <w:webHidden/>
-              </w:rPr>
               <w:t>3</w:t>
-            </w:r>
-            <w:r>
-              <w:rPr>
-                <w:noProof/>
-                <w:webHidden/>
-              </w:rPr>
               <w:fldChar w:fldCharType="end"/>
             </w:r>
           </w:hyperlink>
@@ -463,46 +381,10 @@
                 <w:webHidden/>
               </w:rPr>
               <w:tab/>
-            </w:r>
-            <w:r>
-              <w:rPr>
-                <w:noProof/>
-                <w:webHidden/>
-              </w:rPr>
               <w:fldChar w:fldCharType="begin"/>
-            </w:r>
-            <w:r>
-              <w:rPr>
-                <w:noProof/>
-                <w:webHidden/>
-              </w:rPr>
               <w:instrText xml:space="preserve"> PAGEREF _Toc241874112 \h </w:instrText>
-            </w:r>
-            <w:r>
-              <w:rPr>
-                <w:noProof/>
-                <w:webHidden/>
-              </w:rPr>
-            </w:r>
-            <w:r>
-              <w:rPr>
-                <w:noProof/>
-                <w:webHidden/>
-              </w:rPr>
               <w:fldChar w:fldCharType="separate"/>
-            </w:r>
-            <w:r>
-              <w:rPr>
-                <w:noProof/>
-                <w:webHidden/>
-              </w:rPr>
               <w:t>3</w:t>
-            </w:r>
-            <w:r>
-              <w:rPr>
-                <w:noProof/>
-                <w:webHidden/>
-              </w:rPr>
               <w:fldChar w:fldCharType="end"/>
             </w:r>
           </w:hyperlink>
@@ -532,46 +414,10 @@
                 <w:webHidden/>
               </w:rPr>
               <w:tab/>
-            </w:r>
-            <w:r>
-              <w:rPr>
-                <w:noProof/>
-                <w:webHidden/>
-              </w:rPr>
               <w:fldChar w:fldCharType="begin"/>
-            </w:r>
-            <w:r>
-              <w:rPr>
-                <w:noProof/>
-                <w:webHidden/>
-              </w:rPr>
               <w:instrText xml:space="preserve"> PAGEREF _Toc241874113 \h </w:instrText>
-            </w:r>
-            <w:r>
-              <w:rPr>
-                <w:noProof/>
-                <w:webHidden/>
-              </w:rPr>
-            </w:r>
-            <w:r>
-              <w:rPr>
-                <w:noProof/>
-                <w:webHidden/>
-              </w:rPr>
               <w:fldChar w:fldCharType="separate"/>
-            </w:r>
-            <w:r>
-              <w:rPr>
-                <w:noProof/>
-                <w:webHidden/>
-              </w:rPr>
               <w:t>9</w:t>
-            </w:r>
-            <w:r>
-              <w:rPr>
-                <w:noProof/>
-                <w:webHidden/>
-              </w:rPr>
               <w:fldChar w:fldCharType="end"/>
             </w:r>
           </w:hyperlink>
@@ -602,46 +448,10 @@
                 <w:webHidden/>
               </w:rPr>
               <w:tab/>
-            </w:r>
-            <w:r>
-              <w:rPr>
-                <w:noProof/>
-                <w:webHidden/>
-              </w:rPr>
               <w:fldChar w:fldCharType="begin"/>
-            </w:r>
-            <w:r>
-              <w:rPr>
-                <w:noProof/>
-                <w:webHidden/>
-              </w:rPr>
               <w:instrText xml:space="preserve"> PAGEREF _Toc241874114 \h </w:instrText>
-            </w:r>
-            <w:r>
-              <w:rPr>
-                <w:noProof/>
-                <w:webHidden/>
-              </w:rPr>
-            </w:r>
-            <w:r>
-              <w:rPr>
-                <w:noProof/>
-                <w:webHidden/>
-              </w:rPr>
               <w:fldChar w:fldCharType="separate"/>
-            </w:r>
-            <w:r>
-              <w:rPr>
-                <w:noProof/>
-                <w:webHidden/>
-              </w:rPr>
               <w:t>10</w:t>
-            </w:r>
-            <w:r>
-              <w:rPr>
-                <w:noProof/>
-                <w:webHidden/>
-              </w:rPr>
               <w:fldChar w:fldCharType="end"/>
             </w:r>
           </w:hyperlink>
@@ -673,46 +483,10 @@
                 <w:webHidden/>
               </w:rPr>
               <w:tab/>
-            </w:r>
-            <w:r>
-              <w:rPr>
-                <w:noProof/>
-                <w:webHidden/>
-              </w:rPr>
               <w:fldChar w:fldCharType="begin"/>
-            </w:r>
-            <w:r>
-              <w:rPr>
-                <w:noProof/>
-                <w:webHidden/>
-              </w:rPr>
               <w:instrText xml:space="preserve"> PAGEREF _Toc241874115 \h </w:instrText>
-            </w:r>
-            <w:r>
-              <w:rPr>
-                <w:noProof/>
-                <w:webHidden/>
-              </w:rPr>
-            </w:r>
-            <w:r>
-              <w:rPr>
-                <w:noProof/>
-                <w:webHidden/>
-              </w:rPr>
               <w:fldChar w:fldCharType="separate"/>
-            </w:r>
-            <w:r>
-              <w:rPr>
-                <w:noProof/>
-                <w:webHidden/>
-              </w:rPr>
               <w:t>11</w:t>
-            </w:r>
-            <w:r>
-              <w:rPr>
-                <w:noProof/>
-                <w:webHidden/>
-              </w:rPr>
               <w:fldChar w:fldCharType="end"/>
             </w:r>
           </w:hyperlink>
@@ -744,46 +518,10 @@
                 <w:webHidden/>
               </w:rPr>
               <w:tab/>
-            </w:r>
-            <w:r>
-              <w:rPr>
-                <w:noProof/>
-                <w:webHidden/>
-              </w:rPr>
               <w:fldChar w:fldCharType="begin"/>
-            </w:r>
-            <w:r>
-              <w:rPr>
-                <w:noProof/>
-                <w:webHidden/>
-              </w:rPr>
               <w:instrText xml:space="preserve"> PAGEREF _Toc241874116 \h </w:instrText>
-            </w:r>
-            <w:r>
-              <w:rPr>
-                <w:noProof/>
-                <w:webHidden/>
-              </w:rPr>
-            </w:r>
-            <w:r>
-              <w:rPr>
-                <w:noProof/>
-                <w:webHidden/>
-              </w:rPr>
               <w:fldChar w:fldCharType="separate"/>
-            </w:r>
-            <w:r>
-              <w:rPr>
-                <w:noProof/>
-                <w:webHidden/>
-              </w:rPr>
               <w:t>11</w:t>
-            </w:r>
-            <w:r>
-              <w:rPr>
-                <w:noProof/>
-                <w:webHidden/>
-              </w:rPr>
               <w:fldChar w:fldCharType="end"/>
             </w:r>
           </w:hyperlink>
@@ -878,7 +616,7 @@
           <w:sz w:val="20"/>
           <w:szCs w:val="20"/>
         </w:rPr>
-        <w:t>El MVP se centra en el monitoreo de actividad, los avisos de uso prolongado, el control mediante gestos, el control mediante voz, la interfaz de usuario y el almacenamiento local de la información necesaria para su funcionamiento, como la configuración del usuario, las sesiones de uso y las pausas registradas. De forma complementaria, se incorporan macros personalizadas que permiten asociar frases de voz o gestos a secuencias de acciones del computador.</w:t>
+        <w:t xml:space="preserve">El MVP se centra en el monitoreo de actividad, los avisos de uso prolongado, el control mediante gestos, el control mediante voz, la interfaz de usuario y las cuentas de usuario, junto con el almacenamiento de la información necesaria para su funcionamiento en un servidor desarrollado por el equipo, como la configuración del usuario, las sesiones de uso y las pausas registradas. De forma complementaria, se incorporan macros personalizadas que permiten asociar frases de voz o gestos a secuencias de acciones del computador.</w:t>
       </w:r>
     </w:p>
     <w:p>
@@ -1625,7 +1363,7 @@
                 <w:sz w:val="20"/>
                 <w:szCs w:val="20"/>
               </w:rPr>
-              <w:t>El contador mantiene el tiempo correctamente y permite iniciar un nuevo período después del aviso.</w:t>
+              <w:t>El contador mantiene el tiempo correctamente y permite iniciar un nuevo período después del aviso o después de una pausa registrada por inactividad (PB-35).</w:t>
             </w:r>
           </w:p>
         </w:tc>
@@ -5430,7 +5168,7 @@
                 <w:sz w:val="20"/>
                 <w:szCs w:val="20"/>
               </w:rPr>
-              <w:t>PB-32</w:t>
+              <w:t xml:space="preserve">PB-32</w:t>
             </w:r>
           </w:p>
         </w:tc>
@@ -5453,7 +5191,7 @@
                 <w:sz w:val="20"/>
                 <w:szCs w:val="20"/>
               </w:rPr>
-              <w:t>Persistencia de datos</w:t>
+              <w:t xml:space="preserve">Persistencia de datos</w:t>
             </w:r>
           </w:p>
         </w:tc>
@@ -5476,7 +5214,7 @@
                 <w:sz w:val="20"/>
                 <w:szCs w:val="20"/>
               </w:rPr>
-              <w:t>Implementar base de datos local</w:t>
+              <w:t xml:space="preserve">Implementar base de datos</w:t>
             </w:r>
           </w:p>
         </w:tc>
@@ -5499,7 +5237,7 @@
                 <w:sz w:val="20"/>
                 <w:szCs w:val="20"/>
               </w:rPr>
-              <w:t>El sistema debe contar con una base de datos local que almacene la información de ErgoSense según el modelo de datos definido en la sección 2.1.</w:t>
+              <w:t xml:space="preserve">El sistema debe contar con una base de datos PostgreSQL, alojada en el servidor de ErgoSense, que almacene la información según el modelo de datos definido en la sección 2.1.</w:t>
             </w:r>
           </w:p>
         </w:tc>
@@ -5522,7 +5260,7 @@
                 <w:sz w:val="20"/>
                 <w:szCs w:val="20"/>
               </w:rPr>
-              <w:t>Alta</w:t>
+              <w:t xml:space="preserve">Alta</w:t>
             </w:r>
           </w:p>
         </w:tc>
@@ -5545,7 +5283,7 @@
                 <w:sz w:val="20"/>
                 <w:szCs w:val="20"/>
               </w:rPr>
-              <w:t>Al iniciar la aplicación por primera vez se crean las tablas y relaciones definidas, y la información almacenada se conserva al cerrar y volver a abrir la aplicación.</w:t>
+              <w:t xml:space="preserve">Al levantar el servidor por primera vez se crean las tablas y relaciones definidas, y la información almacenada se conserva al reiniciar el servidor y la aplicación.</w:t>
             </w:r>
           </w:p>
         </w:tc>
@@ -5570,7 +5308,7 @@
                 <w:sz w:val="20"/>
                 <w:szCs w:val="20"/>
               </w:rPr>
-              <w:t>PB-33</w:t>
+              <w:t xml:space="preserve">PB-33</w:t>
             </w:r>
           </w:p>
         </w:tc>
@@ -5593,7 +5331,7 @@
                 <w:sz w:val="20"/>
                 <w:szCs w:val="20"/>
               </w:rPr>
-              <w:t>Persistencia de datos</w:t>
+              <w:t xml:space="preserve">Cuentas y servidor</w:t>
             </w:r>
           </w:p>
         </w:tc>
@@ -5616,7 +5354,7 @@
                 <w:sz w:val="20"/>
                 <w:szCs w:val="20"/>
               </w:rPr>
-              <w:t>Registrar perfil de usuario</w:t>
+              <w:t xml:space="preserve">Crear cuenta de usuario</w:t>
             </w:r>
           </w:p>
         </w:tc>
@@ -5639,7 +5377,7 @@
                 <w:sz w:val="20"/>
                 <w:szCs w:val="20"/>
               </w:rPr>
-              <w:t>El sistema debe registrar un perfil local de usuario identificado por su nombre, al cual se asocian su configuración, sesiones de uso, macros y aplicaciones.</w:t>
+              <w:t xml:space="preserve">El usuario debe poder crear una cuenta indicando su nombre, correo electrónico y contraseña, a la cual se asocian su configuración, sesiones de uso, macros y aplicaciones.</w:t>
             </w:r>
           </w:p>
         </w:tc>
@@ -5662,7 +5400,7 @@
                 <w:sz w:val="20"/>
                 <w:szCs w:val="20"/>
               </w:rPr>
-              <w:t>Alta</w:t>
+              <w:t xml:space="preserve">Alta</w:t>
             </w:r>
           </w:p>
         </w:tc>
@@ -5685,7 +5423,7 @@
                 <w:sz w:val="20"/>
                 <w:szCs w:val="20"/>
               </w:rPr>
-              <w:t>Al registrar el perfil se almacenan su nombre y fecha de creación, y se genera su configuración con los valores por defecto.</w:t>
+              <w:t xml:space="preserve">Al crear la cuenta se almacenan su nombre, correo y fecha de creación, y se genera su configuración con los valores por defecto; no se permite registrar un correo ya utilizado y la contraseña se almacena solo como hash, nunca en texto plano.</w:t>
             </w:r>
           </w:p>
         </w:tc>
@@ -5919,7 +5657,7 @@
                 <w:sz w:val="20"/>
                 <w:szCs w:val="20"/>
               </w:rPr>
-              <w:t>El sistema debe registrar una pausa cuando el usuario no presente actividad durante el tiempo de inactividad configurado (15 minutos por defecto), asociándola a la sesión de uso en curso.</w:t>
+              <w:t xml:space="preserve">El sistema debe registrar una pausa cuando el usuario no presente actividad durante el tiempo de inactividad configurado (10 minutos por defecto), asociándola a la sesión de uso en curso.</w:t>
             </w:r>
           </w:p>
         </w:tc>
@@ -5965,7 +5703,7 @@
                 <w:sz w:val="20"/>
                 <w:szCs w:val="20"/>
               </w:rPr>
-              <w:t>Al superar el tiempo de inactividad configurado se registra la pausa con su hora de inicio y, al retomar la actividad, se registra su hora de término.</w:t>
+              <w:t>Al superar el tiempo de inactividad configurado se registra la pausa con su hora de inicio y, al retomar la actividad, se registra su hora de término y el período de aviso de 60 minutos comienza nuevamente desde cero. Las inactividades menores al tiempo configurado no generan una pausa ni reinician el período.</w:t>
             </w:r>
           </w:p>
         </w:tc>
@@ -6690,7 +6428,7 @@
                 <w:sz w:val="20"/>
                 <w:szCs w:val="20"/>
               </w:rPr>
-              <w:t>PB-41</w:t>
+              <w:t xml:space="preserve">PB-41</w:t>
             </w:r>
           </w:p>
         </w:tc>
@@ -6713,7 +6451,7 @@
                 <w:sz w:val="20"/>
                 <w:szCs w:val="20"/>
               </w:rPr>
-              <w:t>Macros personalizadas</w:t>
+              <w:t xml:space="preserve">Macros personalizadas</w:t>
             </w:r>
           </w:p>
         </w:tc>
@@ -6736,7 +6474,7 @@
                 <w:sz w:val="20"/>
                 <w:szCs w:val="20"/>
               </w:rPr>
-              <w:t>Registrar aplicaciones</w:t>
+              <w:t xml:space="preserve">Registrar aplicaciones</w:t>
             </w:r>
           </w:p>
         </w:tc>
@@ -6759,7 +6497,7 @@
                 <w:sz w:val="20"/>
                 <w:szCs w:val="20"/>
               </w:rPr>
-              <w:t>El usuario debe poder registrar aplicaciones indicando su nombre y la ruta de su ejecutable, para utilizarlas en acciones de tipo abrir aplicación.</w:t>
+              <w:t xml:space="preserve">El usuario debe poder registrar aplicaciones en cada computador, indicando su nombre y la ruta de su ejecutable, para utilizarlas en acciones de tipo abrir aplicación.</w:t>
             </w:r>
           </w:p>
         </w:tc>
@@ -6782,7 +6520,7 @@
                 <w:sz w:val="20"/>
                 <w:szCs w:val="20"/>
               </w:rPr>
-              <w:t>Media</w:t>
+              <w:t xml:space="preserve">Media</w:t>
             </w:r>
           </w:p>
         </w:tc>
@@ -6805,7 +6543,7 @@
                 <w:sz w:val="20"/>
                 <w:szCs w:val="20"/>
               </w:rPr>
-              <w:t>Las aplicaciones registradas se almacenan y pueden seleccionarse al configurar una acción de abrir aplicación.</w:t>
+              <w:t xml:space="preserve">Las aplicaciones registradas se almacenan y pueden seleccionarse al configurar una acción de abrir aplicación; como la ruta depende de cada computador, cada aplicación queda asociada al equipo en que se registra.</w:t>
             </w:r>
           </w:p>
         </w:tc>
@@ -7250,7 +6988,7 @@
                 <w:sz w:val="20"/>
                 <w:szCs w:val="20"/>
               </w:rPr>
-              <w:t>PB-45</w:t>
+              <w:t xml:space="preserve">PB-45</w:t>
             </w:r>
           </w:p>
         </w:tc>
@@ -7273,7 +7011,7 @@
                 <w:sz w:val="20"/>
                 <w:szCs w:val="20"/>
               </w:rPr>
-              <w:t>Integración</w:t>
+              <w:t xml:space="preserve">Integración</w:t>
             </w:r>
           </w:p>
         </w:tc>
@@ -7296,7 +7034,7 @@
                 <w:sz w:val="20"/>
                 <w:szCs w:val="20"/>
               </w:rPr>
-              <w:t>Integrar base de datos con los módulos</w:t>
+              <w:t xml:space="preserve">Integrar base de datos con los módulos</w:t>
             </w:r>
           </w:p>
         </w:tc>
@@ -7319,7 +7057,7 @@
                 <w:sz w:val="20"/>
                 <w:szCs w:val="20"/>
               </w:rPr>
-              <w:t>Los módulos de monitoreo, configuración, voz, gestos, macros e interfaz deben almacenar y recuperar su información desde la base de datos local.</w:t>
+              <w:t xml:space="preserve">Los módulos de monitoreo, configuración, voz, gestos, macros e interfaz deben almacenar y recuperar su información desde la base de datos del servidor, a través de la API.</w:t>
             </w:r>
           </w:p>
         </w:tc>
@@ -7342,7 +7080,7 @@
                 <w:sz w:val="20"/>
                 <w:szCs w:val="20"/>
               </w:rPr>
-              <w:t>Alta</w:t>
+              <w:t xml:space="preserve">Alta</w:t>
             </w:r>
           </w:p>
         </w:tc>
@@ -7365,7 +7103,7 @@
                 <w:sz w:val="20"/>
                 <w:szCs w:val="20"/>
               </w:rPr>
-              <w:t>La información generada por cada módulo se guarda correctamente y se recupera al volver a iniciar la aplicación.</w:t>
+              <w:t xml:space="preserve">La información generada por cada módulo se guarda correctamente y se recupera al volver a iniciar la aplicación.</w:t>
             </w:r>
           </w:p>
         </w:tc>
@@ -7390,7 +7128,7 @@
                 <w:sz w:val="20"/>
                 <w:szCs w:val="20"/>
               </w:rPr>
-              <w:t>PB-46</w:t>
+              <w:t xml:space="preserve">PB-46</w:t>
             </w:r>
           </w:p>
         </w:tc>
@@ -7413,7 +7151,7 @@
                 <w:sz w:val="20"/>
                 <w:szCs w:val="20"/>
               </w:rPr>
-              <w:t>Pruebas</w:t>
+              <w:t xml:space="preserve">Pruebas</w:t>
             </w:r>
           </w:p>
         </w:tc>
@@ -7436,7 +7174,7 @@
                 <w:sz w:val="20"/>
                 <w:szCs w:val="20"/>
               </w:rPr>
-              <w:t>Validar persistencia de datos</w:t>
+              <w:t xml:space="preserve">Validar persistencia de datos</w:t>
             </w:r>
           </w:p>
         </w:tc>
@@ -7459,7 +7197,7 @@
                 <w:sz w:val="20"/>
                 <w:szCs w:val="20"/>
               </w:rPr>
-              <w:t>Se debe comprobar que el perfil, la configuración, las sesiones de uso, las pausas y las macros se almacenen y recuperen correctamente.</w:t>
+              <w:t xml:space="preserve">Se debe comprobar que la cuenta, la configuración, las sesiones de uso, las pausas y las macros se almacenen y recuperen correctamente.</w:t>
             </w:r>
           </w:p>
         </w:tc>
@@ -7482,7 +7220,7 @@
                 <w:sz w:val="20"/>
                 <w:szCs w:val="20"/>
               </w:rPr>
-              <w:t>Alta</w:t>
+              <w:t xml:space="preserve">Alta</w:t>
             </w:r>
           </w:p>
         </w:tc>
@@ -7505,7 +7243,7 @@
                 <w:sz w:val="20"/>
                 <w:szCs w:val="20"/>
               </w:rPr>
-              <w:t>Los datos registrados durante las pruebas se conservan después de reiniciar la aplicación y respetan las relaciones del modelo de datos.</w:t>
+              <w:t xml:space="preserve">Los datos registrados durante las pruebas se conservan después de reiniciar la aplicación y respetan las relaciones del modelo de datos.</w:t>
             </w:r>
           </w:p>
         </w:tc>
@@ -7646,6 +7384,566 @@
                 <w:szCs w:val="20"/>
               </w:rPr>
               <w:t>Las macros probadas ejecutan sus acciones en el orden configurado y las macros desactivadas no se ejecutan.</w:t>
+            </w:r>
+          </w:p>
+        </w:tc>
+      </w:tr>
+      <w:tr>
+        <w:tc>
+          <w:tcPr>
+            <w:tcW w:w="568" w:type="dxa"/>
+          </w:tcPr>
+          <w:p>
+            <w:pPr>
+              <w:jc w:val="both"/>
+              <w:rPr>
+                <w:rFonts w:ascii="Calibri" w:hAnsi="Calibri" w:cs="Calibri"/>
+                <w:sz w:val="20"/>
+                <w:szCs w:val="20"/>
+              </w:rPr>
+            </w:pPr>
+            <w:r>
+              <w:rPr>
+                <w:rFonts w:ascii="Calibri" w:hAnsi="Calibri" w:cs="Calibri"/>
+                <w:sz w:val="20"/>
+                <w:szCs w:val="20"/>
+              </w:rPr>
+              <w:t xml:space="preserve">PB-48</w:t>
+            </w:r>
+          </w:p>
+        </w:tc>
+        <w:tc>
+          <w:tcPr>
+            <w:tcW w:w="1350" w:type="dxa"/>
+          </w:tcPr>
+          <w:p>
+            <w:pPr>
+              <w:jc w:val="both"/>
+              <w:rPr>
+                <w:rFonts w:ascii="Calibri" w:hAnsi="Calibri" w:cs="Calibri"/>
+                <w:sz w:val="20"/>
+                <w:szCs w:val="20"/>
+              </w:rPr>
+            </w:pPr>
+            <w:r>
+              <w:rPr>
+                <w:rFonts w:ascii="Calibri" w:hAnsi="Calibri" w:cs="Calibri"/>
+                <w:sz w:val="20"/>
+                <w:szCs w:val="20"/>
+              </w:rPr>
+              <w:t xml:space="preserve">Cuentas y servidor</w:t>
+            </w:r>
+          </w:p>
+        </w:tc>
+        <w:tc>
+          <w:tcPr>
+            <w:tcW w:w="1821" w:type="dxa"/>
+          </w:tcPr>
+          <w:p>
+            <w:pPr>
+              <w:jc w:val="both"/>
+              <w:rPr>
+                <w:rFonts w:ascii="Calibri" w:hAnsi="Calibri" w:cs="Calibri"/>
+                <w:sz w:val="20"/>
+                <w:szCs w:val="20"/>
+              </w:rPr>
+            </w:pPr>
+            <w:r>
+              <w:rPr>
+                <w:rFonts w:ascii="Calibri" w:hAnsi="Calibri" w:cs="Calibri"/>
+                <w:sz w:val="20"/>
+                <w:szCs w:val="20"/>
+              </w:rPr>
+              <w:t xml:space="preserve">Iniciar y cerrar sesión</w:t>
+            </w:r>
+          </w:p>
+        </w:tc>
+        <w:tc>
+          <w:tcPr>
+            <w:tcW w:w="1996" w:type="dxa"/>
+          </w:tcPr>
+          <w:p>
+            <w:pPr>
+              <w:jc w:val="both"/>
+              <w:rPr>
+                <w:rFonts w:ascii="Calibri" w:hAnsi="Calibri" w:cs="Calibri"/>
+                <w:sz w:val="20"/>
+                <w:szCs w:val="20"/>
+              </w:rPr>
+            </w:pPr>
+            <w:r>
+              <w:rPr>
+                <w:rFonts w:ascii="Calibri" w:hAnsi="Calibri" w:cs="Calibri"/>
+                <w:sz w:val="20"/>
+                <w:szCs w:val="20"/>
+              </w:rPr>
+              <w:t xml:space="preserve">El usuario debe poder iniciar sesión con su correo y contraseña en cualquier computador y cerrar sesión cuando lo desee.</w:t>
+            </w:r>
+          </w:p>
+        </w:tc>
+        <w:tc>
+          <w:tcPr>
+            <w:tcW w:w="1119" w:type="dxa"/>
+          </w:tcPr>
+          <w:p>
+            <w:pPr>
+              <w:jc w:val="both"/>
+              <w:rPr>
+                <w:rFonts w:ascii="Calibri" w:hAnsi="Calibri" w:cs="Calibri"/>
+                <w:sz w:val="20"/>
+                <w:szCs w:val="20"/>
+              </w:rPr>
+            </w:pPr>
+            <w:r>
+              <w:rPr>
+                <w:rFonts w:ascii="Calibri" w:hAnsi="Calibri" w:cs="Calibri"/>
+                <w:sz w:val="20"/>
+                <w:szCs w:val="20"/>
+              </w:rPr>
+              <w:t xml:space="preserve">Alta</w:t>
+            </w:r>
+          </w:p>
+        </w:tc>
+        <w:tc>
+          <w:tcPr>
+            <w:tcW w:w="2072" w:type="dxa"/>
+          </w:tcPr>
+          <w:p>
+            <w:pPr>
+              <w:jc w:val="both"/>
+              <w:rPr>
+                <w:rFonts w:ascii="Calibri" w:hAnsi="Calibri" w:cs="Calibri"/>
+                <w:sz w:val="20"/>
+                <w:szCs w:val="20"/>
+              </w:rPr>
+            </w:pPr>
+            <w:r>
+              <w:rPr>
+                <w:rFonts w:ascii="Calibri" w:hAnsi="Calibri" w:cs="Calibri"/>
+                <w:sz w:val="20"/>
+                <w:szCs w:val="20"/>
+              </w:rPr>
+              <w:t xml:space="preserve">Con credenciales válidas se inicia sesión y se cargan la configuración y las macros de la cuenta, cualquiera sea el computador; con credenciales inválidas se informa el error sin iniciar sesión; la sesión se mantiene al reiniciar la aplicación sin guardar la contraseña en el equipo, y al cerrar sesión se elimina el token almacenado.</w:t>
+            </w:r>
+          </w:p>
+        </w:tc>
+      </w:tr>
+      <w:tr>
+        <w:tc>
+          <w:tcPr>
+            <w:tcW w:w="568" w:type="dxa"/>
+          </w:tcPr>
+          <w:p>
+            <w:pPr>
+              <w:jc w:val="both"/>
+              <w:rPr>
+                <w:rFonts w:ascii="Calibri" w:hAnsi="Calibri" w:cs="Calibri"/>
+                <w:sz w:val="20"/>
+                <w:szCs w:val="20"/>
+              </w:rPr>
+            </w:pPr>
+            <w:r>
+              <w:rPr>
+                <w:rFonts w:ascii="Calibri" w:hAnsi="Calibri" w:cs="Calibri"/>
+                <w:sz w:val="20"/>
+                <w:szCs w:val="20"/>
+              </w:rPr>
+              <w:t xml:space="preserve">PB-49</w:t>
+            </w:r>
+          </w:p>
+        </w:tc>
+        <w:tc>
+          <w:tcPr>
+            <w:tcW w:w="1350" w:type="dxa"/>
+          </w:tcPr>
+          <w:p>
+            <w:pPr>
+              <w:jc w:val="both"/>
+              <w:rPr>
+                <w:rFonts w:ascii="Calibri" w:hAnsi="Calibri" w:cs="Calibri"/>
+                <w:sz w:val="20"/>
+                <w:szCs w:val="20"/>
+              </w:rPr>
+            </w:pPr>
+            <w:r>
+              <w:rPr>
+                <w:rFonts w:ascii="Calibri" w:hAnsi="Calibri" w:cs="Calibri"/>
+                <w:sz w:val="20"/>
+                <w:szCs w:val="20"/>
+              </w:rPr>
+              <w:t xml:space="preserve">Cuentas y servidor</w:t>
+            </w:r>
+          </w:p>
+        </w:tc>
+        <w:tc>
+          <w:tcPr>
+            <w:tcW w:w="1821" w:type="dxa"/>
+          </w:tcPr>
+          <w:p>
+            <w:pPr>
+              <w:jc w:val="both"/>
+              <w:rPr>
+                <w:rFonts w:ascii="Calibri" w:hAnsi="Calibri" w:cs="Calibri"/>
+                <w:sz w:val="20"/>
+                <w:szCs w:val="20"/>
+              </w:rPr>
+            </w:pPr>
+            <w:r>
+              <w:rPr>
+                <w:rFonts w:ascii="Calibri" w:hAnsi="Calibri" w:cs="Calibri"/>
+                <w:sz w:val="20"/>
+                <w:szCs w:val="20"/>
+              </w:rPr>
+              <w:t xml:space="preserve">Implementar servidor de ErgoSense</w:t>
+            </w:r>
+          </w:p>
+        </w:tc>
+        <w:tc>
+          <w:tcPr>
+            <w:tcW w:w="1996" w:type="dxa"/>
+          </w:tcPr>
+          <w:p>
+            <w:pPr>
+              <w:jc w:val="both"/>
+              <w:rPr>
+                <w:rFonts w:ascii="Calibri" w:hAnsi="Calibri" w:cs="Calibri"/>
+                <w:sz w:val="20"/>
+                <w:szCs w:val="20"/>
+              </w:rPr>
+            </w:pPr>
+            <w:r>
+              <w:rPr>
+                <w:rFonts w:ascii="Calibri" w:hAnsi="Calibri" w:cs="Calibri"/>
+                <w:sz w:val="20"/>
+                <w:szCs w:val="20"/>
+              </w:rPr>
+              <w:t xml:space="preserve">Se debe desarrollar un servidor propio, compuesto por una API REST y la base de datos PostgreSQL, ambos ejecutados en contenedores Docker, a través del cual la aplicación almacena y consulta toda su información.</w:t>
+            </w:r>
+          </w:p>
+        </w:tc>
+        <w:tc>
+          <w:tcPr>
+            <w:tcW w:w="1119" w:type="dxa"/>
+          </w:tcPr>
+          <w:p>
+            <w:pPr>
+              <w:jc w:val="both"/>
+              <w:rPr>
+                <w:rFonts w:ascii="Calibri" w:hAnsi="Calibri" w:cs="Calibri"/>
+                <w:sz w:val="20"/>
+                <w:szCs w:val="20"/>
+              </w:rPr>
+            </w:pPr>
+            <w:r>
+              <w:rPr>
+                <w:rFonts w:ascii="Calibri" w:hAnsi="Calibri" w:cs="Calibri"/>
+                <w:sz w:val="20"/>
+                <w:szCs w:val="20"/>
+              </w:rPr>
+              <w:t xml:space="preserve">Alta</w:t>
+            </w:r>
+          </w:p>
+        </w:tc>
+        <w:tc>
+          <w:tcPr>
+            <w:tcW w:w="2072" w:type="dxa"/>
+          </w:tcPr>
+          <w:p>
+            <w:pPr>
+              <w:jc w:val="both"/>
+              <w:rPr>
+                <w:rFonts w:ascii="Calibri" w:hAnsi="Calibri" w:cs="Calibri"/>
+                <w:sz w:val="20"/>
+                <w:szCs w:val="20"/>
+              </w:rPr>
+            </w:pPr>
+            <w:r>
+              <w:rPr>
+                <w:rFonts w:ascii="Calibri" w:hAnsi="Calibri" w:cs="Calibri"/>
+                <w:sz w:val="20"/>
+                <w:szCs w:val="20"/>
+              </w:rPr>
+              <w:t xml:space="preserve">El servidor se levanta mediante Docker; la aplicación no accede directamente a la base de datos; la API rechaza las solicitudes sin un token válido o con un token vencido, y cada usuario solo puede consultar y modificar sus propios datos.</w:t>
+            </w:r>
+          </w:p>
+        </w:tc>
+      </w:tr>
+      <w:tr>
+        <w:tc>
+          <w:tcPr>
+            <w:tcW w:w="568" w:type="dxa"/>
+          </w:tcPr>
+          <w:p>
+            <w:pPr>
+              <w:jc w:val="both"/>
+              <w:rPr>
+                <w:rFonts w:ascii="Calibri" w:hAnsi="Calibri" w:cs="Calibri"/>
+                <w:sz w:val="20"/>
+                <w:szCs w:val="20"/>
+              </w:rPr>
+            </w:pPr>
+            <w:r>
+              <w:rPr>
+                <w:rFonts w:ascii="Calibri" w:hAnsi="Calibri" w:cs="Calibri"/>
+                <w:sz w:val="20"/>
+                <w:szCs w:val="20"/>
+              </w:rPr>
+              <w:t xml:space="preserve">PB-50</w:t>
+            </w:r>
+          </w:p>
+        </w:tc>
+        <w:tc>
+          <w:tcPr>
+            <w:tcW w:w="1350" w:type="dxa"/>
+          </w:tcPr>
+          <w:p>
+            <w:pPr>
+              <w:jc w:val="both"/>
+              <w:rPr>
+                <w:rFonts w:ascii="Calibri" w:hAnsi="Calibri" w:cs="Calibri"/>
+                <w:sz w:val="20"/>
+                <w:szCs w:val="20"/>
+              </w:rPr>
+            </w:pPr>
+            <w:r>
+              <w:rPr>
+                <w:rFonts w:ascii="Calibri" w:hAnsi="Calibri" w:cs="Calibri"/>
+                <w:sz w:val="20"/>
+                <w:szCs w:val="20"/>
+              </w:rPr>
+              <w:t xml:space="preserve">Cuentas y servidor</w:t>
+            </w:r>
+          </w:p>
+        </w:tc>
+        <w:tc>
+          <w:tcPr>
+            <w:tcW w:w="1821" w:type="dxa"/>
+          </w:tcPr>
+          <w:p>
+            <w:pPr>
+              <w:jc w:val="both"/>
+              <w:rPr>
+                <w:rFonts w:ascii="Calibri" w:hAnsi="Calibri" w:cs="Calibri"/>
+                <w:sz w:val="20"/>
+                <w:szCs w:val="20"/>
+              </w:rPr>
+            </w:pPr>
+            <w:r>
+              <w:rPr>
+                <w:rFonts w:ascii="Calibri" w:hAnsi="Calibri" w:cs="Calibri"/>
+                <w:sz w:val="20"/>
+                <w:szCs w:val="20"/>
+              </w:rPr>
+              <w:t xml:space="preserve">Gestionar pérdida de conexión</w:t>
+            </w:r>
+          </w:p>
+        </w:tc>
+        <w:tc>
+          <w:tcPr>
+            <w:tcW w:w="1996" w:type="dxa"/>
+          </w:tcPr>
+          <w:p>
+            <w:pPr>
+              <w:jc w:val="both"/>
+              <w:rPr>
+                <w:rFonts w:ascii="Calibri" w:hAnsi="Calibri" w:cs="Calibri"/>
+                <w:sz w:val="20"/>
+                <w:szCs w:val="20"/>
+              </w:rPr>
+            </w:pPr>
+            <w:r>
+              <w:rPr>
+                <w:rFonts w:ascii="Calibri" w:hAnsi="Calibri" w:cs="Calibri"/>
+                <w:sz w:val="20"/>
+                <w:szCs w:val="20"/>
+              </w:rPr>
+              <w:t xml:space="preserve">Si se pierde la conexión con el servidor durante el uso, la aplicación debe informarlo al usuario y conservar temporalmente los registros pendientes para enviarlos al recuperar la conexión.</w:t>
+            </w:r>
+          </w:p>
+        </w:tc>
+        <w:tc>
+          <w:tcPr>
+            <w:tcW w:w="1119" w:type="dxa"/>
+          </w:tcPr>
+          <w:p>
+            <w:pPr>
+              <w:jc w:val="both"/>
+              <w:rPr>
+                <w:rFonts w:ascii="Calibri" w:hAnsi="Calibri" w:cs="Calibri"/>
+                <w:sz w:val="20"/>
+                <w:szCs w:val="20"/>
+              </w:rPr>
+            </w:pPr>
+            <w:r>
+              <w:rPr>
+                <w:rFonts w:ascii="Calibri" w:hAnsi="Calibri" w:cs="Calibri"/>
+                <w:sz w:val="20"/>
+                <w:szCs w:val="20"/>
+              </w:rPr>
+              <w:t xml:space="preserve">Media</w:t>
+            </w:r>
+          </w:p>
+        </w:tc>
+        <w:tc>
+          <w:tcPr>
+            <w:tcW w:w="2072" w:type="dxa"/>
+          </w:tcPr>
+          <w:p>
+            <w:pPr>
+              <w:jc w:val="both"/>
+              <w:rPr>
+                <w:rFonts w:ascii="Calibri" w:hAnsi="Calibri" w:cs="Calibri"/>
+                <w:sz w:val="20"/>
+                <w:szCs w:val="20"/>
+              </w:rPr>
+            </w:pPr>
+            <w:r>
+              <w:rPr>
+                <w:rFonts w:ascii="Calibri" w:hAnsi="Calibri" w:cs="Calibri"/>
+                <w:sz w:val="20"/>
+                <w:szCs w:val="20"/>
+              </w:rPr>
+              <w:t xml:space="preserve">Ante una pérdida de conexión se muestra un aviso; el monitoreo, los avisos, los gestos, la voz y las macros siguen funcionando con la información ya cargada, y los registros pendientes se envían automáticamente al recuperar la conexión.</w:t>
+            </w:r>
+          </w:p>
+        </w:tc>
+      </w:tr>
+      <w:tr>
+        <w:tc>
+          <w:tcPr>
+            <w:tcW w:w="568" w:type="dxa"/>
+          </w:tcPr>
+          <w:p>
+            <w:pPr>
+              <w:jc w:val="both"/>
+              <w:rPr>
+                <w:rFonts w:ascii="Calibri" w:hAnsi="Calibri" w:cs="Calibri"/>
+                <w:sz w:val="20"/>
+                <w:szCs w:val="20"/>
+              </w:rPr>
+            </w:pPr>
+            <w:r>
+              <w:rPr>
+                <w:rFonts w:ascii="Calibri" w:hAnsi="Calibri" w:cs="Calibri"/>
+                <w:sz w:val="20"/>
+                <w:szCs w:val="20"/>
+              </w:rPr>
+              <w:t xml:space="preserve">PB-51</w:t>
+            </w:r>
+          </w:p>
+        </w:tc>
+        <w:tc>
+          <w:tcPr>
+            <w:tcW w:w="1350" w:type="dxa"/>
+          </w:tcPr>
+          <w:p>
+            <w:pPr>
+              <w:jc w:val="both"/>
+              <w:rPr>
+                <w:rFonts w:ascii="Calibri" w:hAnsi="Calibri" w:cs="Calibri"/>
+                <w:sz w:val="20"/>
+                <w:szCs w:val="20"/>
+              </w:rPr>
+            </w:pPr>
+            <w:r>
+              <w:rPr>
+                <w:rFonts w:ascii="Calibri" w:hAnsi="Calibri" w:cs="Calibri"/>
+                <w:sz w:val="20"/>
+                <w:szCs w:val="20"/>
+              </w:rPr>
+              <w:t xml:space="preserve">Pruebas</w:t>
+            </w:r>
+          </w:p>
+        </w:tc>
+        <w:tc>
+          <w:tcPr>
+            <w:tcW w:w="1821" w:type="dxa"/>
+          </w:tcPr>
+          <w:p>
+            <w:pPr>
+              <w:jc w:val="both"/>
+              <w:rPr>
+                <w:rFonts w:ascii="Calibri" w:hAnsi="Calibri" w:cs="Calibri"/>
+                <w:sz w:val="20"/>
+                <w:szCs w:val="20"/>
+              </w:rPr>
+            </w:pPr>
+            <w:r>
+              <w:rPr>
+                <w:rFonts w:ascii="Calibri" w:hAnsi="Calibri" w:cs="Calibri"/>
+                <w:sz w:val="20"/>
+                <w:szCs w:val="20"/>
+              </w:rPr>
+              <w:t xml:space="preserve">Validar cuentas y servidor</w:t>
+            </w:r>
+          </w:p>
+        </w:tc>
+        <w:tc>
+          <w:tcPr>
+            <w:tcW w:w="1996" w:type="dxa"/>
+          </w:tcPr>
+          <w:p>
+            <w:pPr>
+              <w:jc w:val="both"/>
+              <w:rPr>
+                <w:rFonts w:ascii="Calibri" w:hAnsi="Calibri" w:cs="Calibri"/>
+                <w:sz w:val="20"/>
+                <w:szCs w:val="20"/>
+              </w:rPr>
+            </w:pPr>
+            <w:r>
+              <w:rPr>
+                <w:rFonts w:ascii="Calibri" w:hAnsi="Calibri" w:cs="Calibri"/>
+                <w:sz w:val="20"/>
+                <w:szCs w:val="20"/>
+              </w:rPr>
+              <w:t xml:space="preserve">Se debe comprobar la creación de cuentas, el inicio y cierre de sesión, la seguridad de la API, el acceso desde distintos computadores y la pérdida de conexión.</w:t>
+            </w:r>
+          </w:p>
+        </w:tc>
+        <w:tc>
+          <w:tcPr>
+            <w:tcW w:w="1119" w:type="dxa"/>
+          </w:tcPr>
+          <w:p>
+            <w:pPr>
+              <w:jc w:val="both"/>
+              <w:rPr>
+                <w:rFonts w:ascii="Calibri" w:hAnsi="Calibri" w:cs="Calibri"/>
+                <w:sz w:val="20"/>
+                <w:szCs w:val="20"/>
+              </w:rPr>
+            </w:pPr>
+            <w:r>
+              <w:rPr>
+                <w:rFonts w:ascii="Calibri" w:hAnsi="Calibri" w:cs="Calibri"/>
+                <w:sz w:val="20"/>
+                <w:szCs w:val="20"/>
+              </w:rPr>
+              <w:t xml:space="preserve">Alta</w:t>
+            </w:r>
+          </w:p>
+        </w:tc>
+        <w:tc>
+          <w:tcPr>
+            <w:tcW w:w="2072" w:type="dxa"/>
+          </w:tcPr>
+          <w:p>
+            <w:pPr>
+              <w:jc w:val="both"/>
+              <w:rPr>
+                <w:rFonts w:ascii="Calibri" w:hAnsi="Calibri" w:cs="Calibri"/>
+                <w:sz w:val="20"/>
+                <w:szCs w:val="20"/>
+              </w:rPr>
+            </w:pPr>
+            <w:r>
+              <w:rPr>
+                <w:rFonts w:ascii="Calibri" w:hAnsi="Calibri" w:cs="Calibri"/>
+                <w:sz w:val="20"/>
+                <w:szCs w:val="20"/>
+              </w:rPr>
+              <w:t xml:space="preserve">Una configuración o macro creada en un computador está disponible en otro al iniciar sesión; la API rechaza el acceso a datos de otra cuenta, y ante una pérdida de conexión los registros pendientes se envían al recuperarla.</w:t>
             </w:r>
           </w:p>
         </w:tc>
@@ -7691,7 +7989,7 @@
           <w:sz w:val="20"/>
           <w:szCs w:val="20"/>
         </w:rPr>
-        <w:t>Para dar soporte a los elementos del Product Backlog, ErgoSense utilizará una base de datos local que almacena el perfil del usuario, su configuración, las sesiones de uso y pausas registradas, las macros personalizadas y las aplicaciones registradas. Todas las tablas utilizan un identificador numérico autoincremental como clave primaria (PK); las claves foráneas (FK) indican la tabla con la que se relaciona cada registro.</w:t>
+        <w:t xml:space="preserve">Para dar soporte a los elementos del Product Backlog, ErgoSense utilizará una única base de datos PostgreSQL, alojada en el servidor desarrollado por el equipo y ejecutada en un contenedor Docker. La aplicación de escritorio no accede directamente a la base de datos: toda la información se lee y escribe a través de la API del servidor, que identifica al usuario mediante un token de sesión. La base de datos almacena las cuentas de usuario, su configuración, las sesiones de uso y pausas registradas, las macros personalizadas y las aplicaciones registradas. Todas las tablas utilizan un identificador numérico autoincremental como clave primaria (PK); las claves foráneas (FK) indican la tabla con la que se relaciona cada registro.</w:t>
       </w:r>
     </w:p>
     <w:tbl>
@@ -7815,7 +8113,7 @@
                 <w:sz w:val="20"/>
                 <w:szCs w:val="20"/>
               </w:rPr>
-              <w:t>users</w:t>
+              <w:t xml:space="preserve">users</w:t>
             </w:r>
           </w:p>
         </w:tc>
@@ -7837,7 +8135,7 @@
                 <w:sz w:val="20"/>
                 <w:szCs w:val="20"/>
               </w:rPr>
-              <w:t>Perfil local del usuario de la aplicación.</w:t>
+              <w:t xml:space="preserve">Cuentas de usuario de ErgoSense.</w:t>
             </w:r>
           </w:p>
         </w:tc>
@@ -7859,7 +8157,7 @@
                 <w:sz w:val="20"/>
                 <w:szCs w:val="20"/>
               </w:rPr>
-              <w:t>id (PK), name (obligatorio), created_at</w:t>
+              <w:t xml:space="preserve">id (PK), name (obligatorio), email (obligatorio, único), password_hash (obligatorio), created_at</w:t>
             </w:r>
           </w:p>
         </w:tc>
@@ -7881,7 +8179,7 @@
                 <w:sz w:val="20"/>
                 <w:szCs w:val="20"/>
               </w:rPr>
-              <w:t>PB-32, PB-33</w:t>
+              <w:t xml:space="preserve">PB-32, PB-33, PB-48</w:t>
             </w:r>
           </w:p>
         </w:tc>
@@ -7949,7 +8247,7 @@
                 <w:sz w:val="20"/>
                 <w:szCs w:val="20"/>
               </w:rPr>
-              <w:t>id (PK), user_id (FK → users, único), inactivity_break_minutes (15 por defecto), voice_enabled (activado por defecto), gesture_enabled (activado por defecto)</w:t>
+              <w:t xml:space="preserve">id (PK), user_id (FK → users, único), inactivity_break_minutes (10 por defecto), voice_enabled (activado por defecto), gesture_enabled (activado por defecto)</w:t>
             </w:r>
           </w:p>
         </w:tc>
@@ -8355,7 +8653,7 @@
                 <w:sz w:val="20"/>
                 <w:szCs w:val="20"/>
               </w:rPr>
-              <w:t>macro_actions</w:t>
+              <w:t xml:space="preserve">macro_actions</w:t>
             </w:r>
           </w:p>
         </w:tc>
@@ -8377,7 +8675,7 @@
                 <w:sz w:val="20"/>
                 <w:szCs w:val="20"/>
               </w:rPr>
-              <w:t>Acciones que ejecuta una macro, según su orden de ejecución.</w:t>
+              <w:t xml:space="preserve">Acciones que ejecuta una macro, según su orden de ejecución. En las acciones OPEN_APP, action_value guarda el nombre de la aplicación registrada.</w:t>
             </w:r>
           </w:p>
         </w:tc>
@@ -8399,7 +8697,7 @@
                 <w:sz w:val="20"/>
                 <w:szCs w:val="20"/>
               </w:rPr>
-              <w:t>id (PK), macro_id (FK → macros), action_type (OPEN_URL, OPEN_APP, KEY_PRESS, TYPE_TEXT o MOUSE_CLICK), action_value, execution_order (obligatorio)</w:t>
+              <w:t xml:space="preserve">id (PK), macro_id (FK → macros), action_type (OPEN_URL, OPEN_APP, KEY_PRESS, TYPE_TEXT o MOUSE_CLICK), action_value, execution_order (obligatorio)</w:t>
             </w:r>
           </w:p>
         </w:tc>
@@ -8421,7 +8719,7 @@
                 <w:sz w:val="20"/>
                 <w:szCs w:val="20"/>
               </w:rPr>
-              <w:t>PB-40, PB-42</w:t>
+              <w:t xml:space="preserve">PB-40, PB-42</w:t>
             </w:r>
           </w:p>
         </w:tc>
@@ -8445,7 +8743,7 @@
                 <w:sz w:val="20"/>
                 <w:szCs w:val="20"/>
               </w:rPr>
-              <w:t>applications</w:t>
+              <w:t xml:space="preserve">applications</w:t>
             </w:r>
           </w:p>
         </w:tc>
@@ -8467,7 +8765,7 @@
                 <w:sz w:val="20"/>
                 <w:szCs w:val="20"/>
               </w:rPr>
-              <w:t>Aplicaciones registradas por el usuario para ser abiertas mediante macros.</w:t>
+              <w:t xml:space="preserve">Aplicaciones registradas por el usuario para ser abiertas mediante macros. Como la ruta del ejecutable depende de cada computador, cada registro indica el equipo al que pertenece.</w:t>
             </w:r>
           </w:p>
         </w:tc>
@@ -8489,7 +8787,7 @@
                 <w:sz w:val="20"/>
                 <w:szCs w:val="20"/>
               </w:rPr>
-              <w:t>id (PK), user_id (FK → users), name (obligatorio), executable_path (obligatorio)</w:t>
+              <w:t xml:space="preserve">id (PK), user_id (FK → users), device_name (obligatorio), name (obligatorio), executable_path (obligatorio)</w:t>
             </w:r>
           </w:p>
         </w:tc>
@@ -8511,7 +8809,7 @@
                 <w:sz w:val="20"/>
                 <w:szCs w:val="20"/>
               </w:rPr>
-              <w:t>PB-41</w:t>
+              <w:t xml:space="preserve">PB-41</w:t>
             </w:r>
           </w:p>
         </w:tc>
@@ -8540,7 +8838,7 @@
           <w:sz w:val="20"/>
           <w:szCs w:val="20"/>
         </w:rPr>
-        <w:t>Relaciones: un usuario posee una única configuración (la restricción de unicidad sobre settings.user_id asegura una relación 1:1) y puede tener múltiples sesiones de uso, macros y aplicaciones registradas (1:N). Cada sesión de uso puede contener múltiples pausas, y cada macro puede tener múltiples activadores y múltiples acciones, estas últimas ejecutadas según execution_order (1:N).</w:t>
+        <w:t xml:space="preserve">Relaciones: un usuario posee una única configuración (la restricción de unicidad sobre settings.user_id asegura una relación 1:1) y puede tener múltiples sesiones de uso, macros y aplicaciones registradas (1:N). Cada sesión de uso puede contener múltiples pausas, y cada macro puede tener múltiples activadores y múltiples acciones, estas últimas ejecutadas según execution_order (1:N). La contraseña se almacena solo como hash en users.password_hash, nunca en texto plano. En applications, la combinación de user_id, device_name y name es única: al ejecutar una acción OPEN_APP se utiliza la aplicación registrada con ese nombre en el computador actual.</w:t>
       </w:r>
     </w:p>
     <w:p>
@@ -8594,7 +8892,7 @@
           <w:sz w:val="20"/>
           <w:szCs w:val="20"/>
         </w:rPr>
-        <w:t xml:space="preserve"> corresponden a las funcionalidades necesarias para construir y validar el MVP de ErgoSense. Estas incluyen el monitoreo de actividad, los avisos de 60 minutos, el reconocimiento de gestos, el control mediante voz, la interfaz básica, la base de datos local que almacena el perfil, la configuración, las sesiones de uso y las pausas, y la integración de los principales módulos.</w:t>
+        <w:t xml:space="preserve"> corresponden a las funcionalidades necesarias para construir y validar el MVP de ErgoSense. Estas incluyen el monitoreo de actividad, los avisos de 60 minutos, el reconocimiento de gestos, el control mediante voz, la interfaz básica, el servidor con su base de datos PostgreSQL, las cuentas de usuario con inicio de sesión, el almacenamiento de la configuración, las sesiones de uso y las pausas, y la integración de los principales módulos.</w:t>
       </w:r>
     </w:p>
     <w:p>
@@ -8630,7 +8928,7 @@
           <w:sz w:val="20"/>
           <w:szCs w:val="20"/>
         </w:rPr>
-        <w:t xml:space="preserve"> corresponden a funcionalidades complementarias que pueden incorporarse una vez que las funciones principales se encuentren funcionando correctamente. Entre ellas se encuentran algunas acciones adicionales mediante gestos, mejoras relacionadas con la información presentada al usuario, la configuración del tiempo de inactividad para registrar pausas y las macros personalizadas activadas mediante voz o gestos.</w:t>
+        <w:t xml:space="preserve"> corresponden a funcionalidades complementarias que pueden incorporarse una vez que las funciones principales se encuentren funcionando correctamente. Entre ellas se encuentran algunas acciones adicionales mediante gestos, mejoras relacionadas con la información presentada al usuario, la configuración del tiempo de inactividad para registrar pausas, la gestión de la pérdida de conexión y las macros personalizadas activadas mediante voz o gestos.</w:t>
       </w:r>
     </w:p>
     <w:p>
@@ -8691,7 +8989,7 @@
           <w:sz w:val="20"/>
           <w:szCs w:val="20"/>
         </w:rPr>
-        <w:t>El Product Backlog considera como parte del MVP las funcionalidades necesarias para que ErgoSense pueda registrar la actividad del usuario, generar un aviso automático cada 60 minutos, permitir determinadas acciones mediante gestos y comandos de voz, almacenar localmente la configuración, las sesiones de uso y las pausas del usuario, y presentar estas funcionalidades mediante una interfaz de escritorio.</w:t>
+        <w:t xml:space="preserve">El Product Backlog considera como parte del MVP las funcionalidades necesarias para que ErgoSense pueda registrar la actividad del usuario, generar un aviso automático cada 60 minutos, permitir determinadas acciones mediante gestos y comandos de voz, almacenar la configuración, las sesiones de uso, las pausas y las macros del usuario en un servidor propio, accesible mediante su cuenta desde cualquier computador, y presentar estas funcionalidades mediante una interfaz de escritorio.</w:t>
       </w:r>
     </w:p>
     <w:p>
@@ -8709,7 +9007,7 @@
           <w:sz w:val="20"/>
           <w:szCs w:val="20"/>
         </w:rPr>
-        <w:t>El período de aviso de 60 minutos se encuentra definido por el sistema y no será configurable por el usuario en el MVP. Lo que sí podrá ajustar el usuario es el tiempo de inactividad a partir del cual el sistema registra una pausa, que por defecto será de 15 minutos; este valor no modifica el período de aviso.</w:t>
+        <w:t xml:space="preserve">El período de aviso de 60 minutos se encuentra definido por el sistema y no será configurable por el usuario en el MVP; la justificación de este intervalo y sus referencias se presentan en el Product Vision. Lo que sí podrá ajustar el usuario es el tiempo de inactividad a partir del cual el sistema registra una pausa, que por defecto será de 10 minutos; este valor no modifica la duración del período de aviso. Cuando se registra una pausa por inactividad, el período de aviso de 60 minutos se reinicia al retomar la actividad, ya que el usuario efectivamente realizó una pausa.</w:t>
       </w:r>
     </w:p>
     <w:p>
@@ -8745,7 +9043,7 @@
           <w:sz w:val="20"/>
           <w:szCs w:val="20"/>
         </w:rPr>
-        <w:t>La información de ErgoSense se almacenará en una base de datos local asociada a un perfil de usuario identificado por su nombre, sin requerir creación de cuentas, autenticación ni conexión a servicios externos. El detalle de las tablas y sus relaciones se presenta en la sección 2.1.</w:t>
+        <w:t xml:space="preserve">La información de ErgoSense se almacenará en una base de datos PostgreSQL alojada en un servidor desarrollado por el equipo, compuesto por una API REST y la base de datos, ejecutados en contenedores Docker. El usuario deberá crear una cuenta con su correo electrónico y contraseña e iniciar sesión para utilizar la aplicación, lo que le permitirá acceder a su configuración y sus macros desde cualquier computador. Por este motivo, la aplicación requiere conexión a internet para iniciar sesión y almacenar su información; ante una pérdida temporal de conexión, conservará los registros pendientes mientras permanezca abierta y los enviará al recuperarla. El detalle de las tablas y sus relaciones se presenta en la sección 2.1.</w:t>
       </w:r>
     </w:p>
     <w:p>
@@ -8834,7 +9132,7 @@
           <w:sz w:val="20"/>
           <w:szCs w:val="20"/>
         </w:rPr>
-        <w:t>Tampoco forman parte del MVP la creación de comandos de voz fuera del esquema de macros, la ejecución de acciones distintas a los tipos soportados por las macros, el reconocimiento ilimitado de gestos, el control completo del computador, una aplicación móvil, la creación de cuentas de usuario en línea, la sincronización en la nube o un sistema de inteligencia artificial que aprenda individualmente del usuario.</w:t>
+        <w:t xml:space="preserve">Tampoco forman parte del MVP la creación de comandos de voz fuera del esquema de macros, la ejecución de acciones distintas a los tipos soportados por las macros, el reconocimiento ilimitado de gestos, el control completo del computador, una aplicación móvil, el funcionamiento sin conexión a internet, el uso de servicios en la nube o de autenticación de terceros, la recuperación de contraseña por correo electrónico o un sistema de inteligencia artificial que aprenda individualmente del usuario.</w:t>
       </w:r>
     </w:p>
     <w:p>

</xml_diff>

<commit_message>
docs: Se mueven requisitos funcionales al Product Backlog
</commit_message>
<xml_diff>
--- a/FASE 2/Evidencias Proyecto/Documentacion/Product Backlog.docx
+++ b/FASE 2/Evidencias Proyecto/Documentacion/Product Backlog.docx
@@ -1388,7 +1388,7 @@
                 <w:sz w:val="20"/>
                 <w:szCs w:val="20"/>
               </w:rPr>
-              <w:t>PB-05</w:t>
+              <w:t xml:space="preserve">PB-05</w:t>
             </w:r>
           </w:p>
         </w:tc>
@@ -1411,7 +1411,7 @@
                 <w:sz w:val="20"/>
                 <w:szCs w:val="20"/>
               </w:rPr>
-              <w:t>Avisos de uso prolongado</w:t>
+              <w:t xml:space="preserve">Avisos de uso prolongado</w:t>
             </w:r>
           </w:p>
         </w:tc>
@@ -1434,7 +1434,7 @@
                 <w:sz w:val="20"/>
                 <w:szCs w:val="20"/>
               </w:rPr>
-              <w:t>Generar aviso después de 60 minutos</w:t>
+              <w:t xml:space="preserve">Generar aviso después de 60 minutos</w:t>
             </w:r>
           </w:p>
         </w:tc>
@@ -1457,7 +1457,7 @@
                 <w:sz w:val="20"/>
                 <w:szCs w:val="20"/>
               </w:rPr>
-              <w:t>El sistema debe mostrar automáticamente una notificación cuando el usuario alcance 60 minutos de actividad.</w:t>
+              <w:t xml:space="preserve">El sistema debe mostrar automáticamente una notificación cuando el usuario alcance 60 minutos de actividad.</w:t>
             </w:r>
           </w:p>
         </w:tc>
@@ -1480,7 +1480,7 @@
                 <w:sz w:val="20"/>
                 <w:szCs w:val="20"/>
               </w:rPr>
-              <w:t>Alta</w:t>
+              <w:t xml:space="preserve">Alta</w:t>
             </w:r>
           </w:p>
         </w:tc>
@@ -1503,7 +1503,7 @@
                 <w:sz w:val="20"/>
                 <w:szCs w:val="20"/>
               </w:rPr>
-              <w:t>Al alcanzar los 60 minutos, se muestra una notificación recomendando realizar una pausa.</w:t>
+              <w:t xml:space="preserve">Al alcanzar los 60 minutos, se muestra una notificación recomendando realizar una pausa. Si la ventana de ErgoSense está minimizada o en segundo plano, el aviso se muestra como notificación del sistema operativo.</w:t>
             </w:r>
           </w:p>
         </w:tc>
@@ -1668,7 +1668,7 @@
                 <w:sz w:val="20"/>
                 <w:szCs w:val="20"/>
               </w:rPr>
-              <w:t>PB-07</w:t>
+              <w:t xml:space="preserve">PB-07</w:t>
             </w:r>
           </w:p>
         </w:tc>
@@ -1691,7 +1691,7 @@
                 <w:sz w:val="20"/>
                 <w:szCs w:val="20"/>
               </w:rPr>
-              <w:t>Control mediante gestos</w:t>
+              <w:t xml:space="preserve">Control mediante gestos</w:t>
             </w:r>
           </w:p>
         </w:tc>
@@ -1714,7 +1714,7 @@
                 <w:sz w:val="20"/>
                 <w:szCs w:val="20"/>
               </w:rPr>
-              <w:t>Detectar y seguir la mano</w:t>
+              <w:t xml:space="preserve">Detectar y seguir la mano</w:t>
             </w:r>
           </w:p>
         </w:tc>
@@ -1737,7 +1737,7 @@
                 <w:sz w:val="20"/>
                 <w:szCs w:val="20"/>
               </w:rPr>
-              <w:t>El sistema debe utilizar la cámara web para detectar y realizar seguimiento de la mano del usuario.</w:t>
+              <w:t xml:space="preserve">El sistema debe utilizar la cámara web para detectar y realizar seguimiento de la mano del usuario.</w:t>
             </w:r>
           </w:p>
         </w:tc>
@@ -1760,7 +1760,7 @@
                 <w:sz w:val="20"/>
                 <w:szCs w:val="20"/>
               </w:rPr>
-              <w:t>Alta</w:t>
+              <w:t xml:space="preserve">Alta</w:t>
             </w:r>
           </w:p>
         </w:tc>
@@ -1783,7 +1783,7 @@
                 <w:sz w:val="20"/>
                 <w:szCs w:val="20"/>
               </w:rPr>
-              <w:t>La mano es detectada y seguida correctamente mientras se encuentra dentro del área de captura.</w:t>
+              <w:t xml:space="preserve">La mano es detectada y seguida correctamente mientras se encuentra dentro del área de captura. Si no hay una cámara disponible, el sistema lo informa al usuario y las demás funcionalidades siguen disponibles.</w:t>
             </w:r>
           </w:p>
         </w:tc>
@@ -2648,7 +2648,7 @@
                 <w:sz w:val="20"/>
                 <w:szCs w:val="20"/>
               </w:rPr>
-              <w:t>PB-14</w:t>
+              <w:t xml:space="preserve">PB-14</w:t>
             </w:r>
           </w:p>
         </w:tc>
@@ -2671,7 +2671,7 @@
                 <w:sz w:val="20"/>
                 <w:szCs w:val="20"/>
               </w:rPr>
-              <w:t>Control por voz</w:t>
+              <w:t xml:space="preserve">Control por voz</w:t>
             </w:r>
           </w:p>
         </w:tc>
@@ -2694,7 +2694,7 @@
                 <w:sz w:val="20"/>
                 <w:szCs w:val="20"/>
               </w:rPr>
-              <w:t>Reconocer comandos de voz</w:t>
+              <w:t xml:space="preserve">Reconocer comandos de voz</w:t>
             </w:r>
           </w:p>
         </w:tc>
@@ -2717,7 +2717,7 @@
                 <w:sz w:val="20"/>
                 <w:szCs w:val="20"/>
               </w:rPr>
-              <w:t>El sistema debe reconocer comandos de voz previamente definidos por el sistema.</w:t>
+              <w:t xml:space="preserve">El sistema debe reconocer comandos de voz previamente definidos por el sistema.</w:t>
             </w:r>
           </w:p>
         </w:tc>
@@ -2740,7 +2740,7 @@
                 <w:sz w:val="20"/>
                 <w:szCs w:val="20"/>
               </w:rPr>
-              <w:t>Alta</w:t>
+              <w:t xml:space="preserve">Alta</w:t>
             </w:r>
           </w:p>
         </w:tc>
@@ -2763,7 +2763,7 @@
                 <w:sz w:val="20"/>
                 <w:szCs w:val="20"/>
               </w:rPr>
-              <w:t>Los comandos establecidos son reconocidos correctamente cuando son pronunciados en condiciones adecuadas.</w:t>
+              <w:t xml:space="preserve">Los comandos establecidos son reconocidos correctamente cuando son pronunciados en condiciones adecuadas. Si no hay un micrófono disponible, el sistema lo informa al usuario y las demás funcionalidades siguen disponibles.</w:t>
             </w:r>
           </w:p>
         </w:tc>
@@ -3068,7 +3068,7 @@
                 <w:sz w:val="20"/>
                 <w:szCs w:val="20"/>
               </w:rPr>
-              <w:t>PB-17</w:t>
+              <w:t xml:space="preserve">PB-17</w:t>
             </w:r>
           </w:p>
         </w:tc>
@@ -3091,7 +3091,7 @@
                 <w:sz w:val="20"/>
                 <w:szCs w:val="20"/>
               </w:rPr>
-              <w:t>Interfaz de usuario</w:t>
+              <w:t xml:space="preserve">Interfaz de usuario</w:t>
             </w:r>
           </w:p>
         </w:tc>
@@ -3114,7 +3114,7 @@
                 <w:sz w:val="20"/>
                 <w:szCs w:val="20"/>
               </w:rPr>
-              <w:t>Visualizar estado del sistema</w:t>
+              <w:t xml:space="preserve">Visualizar estado del sistema</w:t>
             </w:r>
           </w:p>
         </w:tc>
@@ -3137,7 +3137,7 @@
                 <w:sz w:val="20"/>
                 <w:szCs w:val="20"/>
               </w:rPr>
-              <w:t>La aplicación debe mostrar el estado de las principales funcionalidades de ErgoSense.</w:t>
+              <w:t xml:space="preserve">La aplicación debe mostrar el estado de las principales funcionalidades de ErgoSense.</w:t>
             </w:r>
           </w:p>
         </w:tc>
@@ -3160,7 +3160,7 @@
                 <w:sz w:val="20"/>
                 <w:szCs w:val="20"/>
               </w:rPr>
-              <w:t>Alta</w:t>
+              <w:t xml:space="preserve">Alta</w:t>
             </w:r>
           </w:p>
         </w:tc>
@@ -3183,7 +3183,7 @@
                 <w:sz w:val="20"/>
                 <w:szCs w:val="20"/>
               </w:rPr>
-              <w:t>El usuario puede identificar desde la interfaz qué funcionalidades se encuentran activas o inactivas.</w:t>
+              <w:t xml:space="preserve">El usuario puede identificar desde la interfaz qué funcionalidades se encuentran activas o inactivas. La interfaz muestra un indicador visible mientras la cámara o el micrófono están en uso.</w:t>
             </w:r>
           </w:p>
         </w:tc>
@@ -3488,7 +3488,7 @@
                 <w:sz w:val="20"/>
                 <w:szCs w:val="20"/>
               </w:rPr>
-              <w:t>PB-20</w:t>
+              <w:t xml:space="preserve">PB-20</w:t>
             </w:r>
           </w:p>
         </w:tc>
@@ -3511,7 +3511,7 @@
                 <w:sz w:val="20"/>
                 <w:szCs w:val="20"/>
               </w:rPr>
-              <w:t>Interfaz de usuario</w:t>
+              <w:t xml:space="preserve">Interfaz de usuario</w:t>
             </w:r>
           </w:p>
         </w:tc>
@@ -3534,7 +3534,7 @@
                 <w:sz w:val="20"/>
                 <w:szCs w:val="20"/>
               </w:rPr>
-              <w:t>Activar y desactivar funcionalidades</w:t>
+              <w:t xml:space="preserve">Activar y desactivar funcionalidades</w:t>
             </w:r>
           </w:p>
         </w:tc>
@@ -3557,7 +3557,7 @@
                 <w:sz w:val="20"/>
                 <w:szCs w:val="20"/>
               </w:rPr>
-              <w:t>El usuario debe poder activar o desactivar las funcionalidades disponibles desde la interfaz.</w:t>
+              <w:t xml:space="preserve">El usuario debe poder activar o desactivar las funcionalidades disponibles desde la interfaz.</w:t>
             </w:r>
           </w:p>
         </w:tc>
@@ -3580,7 +3580,7 @@
                 <w:sz w:val="20"/>
                 <w:szCs w:val="20"/>
               </w:rPr>
-              <w:t>Alta</w:t>
+              <w:t xml:space="preserve">Alta</w:t>
             </w:r>
           </w:p>
         </w:tc>
@@ -3603,7 +3603,7 @@
                 <w:sz w:val="20"/>
                 <w:szCs w:val="20"/>
               </w:rPr>
-              <w:t>Las funcionalidades responden correctamente a las acciones de activación y desactivación.</w:t>
+              <w:t xml:space="preserve">Las funcionalidades responden correctamente a las acciones de activación y desactivación. El control por gestos y el control por voz pueden desactivarse en cualquier momento mediante un atajo de teclado.</w:t>
             </w:r>
           </w:p>
         </w:tc>
@@ -5423,7 +5423,7 @@
                 <w:sz w:val="20"/>
                 <w:szCs w:val="20"/>
               </w:rPr>
-              <w:t xml:space="preserve">Al crear la cuenta se almacenan su nombre, correo y fecha de creación, y se genera su configuración con los valores por defecto; no se permite registrar un correo ya utilizado y la contraseña se almacena solo como hash, nunca en texto plano.</w:t>
+              <w:t xml:space="preserve">Al crear la cuenta se almacenan su nombre, correo y fecha de creación, y se genera su configuración con los valores por defecto; no se permite registrar un correo ya utilizado y la contraseña se almacena solo como hash, nunca en texto plano. La contraseña debe tener al menos 8 caracteres e incluir letras y números; en caso contrario, se informa al usuario y la cuenta no se crea.</w:t>
             </w:r>
           </w:p>
         </w:tc>
@@ -7523,7 +7523,7 @@
                 <w:sz w:val="20"/>
                 <w:szCs w:val="20"/>
               </w:rPr>
-              <w:t xml:space="preserve">Con credenciales válidas se inicia sesión y se cargan la configuración y las macros de la cuenta, cualquiera sea el computador; con credenciales inválidas se informa el error sin iniciar sesión; la sesión se mantiene al reiniciar la aplicación sin guardar la contraseña en el equipo, y al cerrar sesión se elimina el token almacenado.</w:t>
+              <w:t xml:space="preserve">Con credenciales válidas se inicia sesión y se cargan la configuración y las macros de la cuenta, cualquiera sea el computador; con credenciales inválidas se informa el error sin iniciar sesión; la sesión se mantiene al reiniciar la aplicación sin guardar la contraseña en el equipo, y al cerrar sesión se elimina el token almacenado. Tras 5 intentos fallidos consecutivos de inicio de sesión, la cuenta no permite nuevos intentos durante 5 minutos.</w:t>
             </w:r>
           </w:p>
         </w:tc>
@@ -7803,7 +7803,7 @@
                 <w:sz w:val="20"/>
                 <w:szCs w:val="20"/>
               </w:rPr>
-              <w:t xml:space="preserve">Ante una pérdida de conexión se muestra un aviso; el monitoreo, los avisos, los gestos, la voz y las macros siguen funcionando con la información ya cargada, y los registros pendientes se envían automáticamente al recuperar la conexión.</w:t>
+              <w:t xml:space="preserve">Ante una pérdida de conexión se muestra un aviso; el monitoreo, los avisos, los gestos, la voz y las macros siguen funcionando con la información ya cargada, y los registros pendientes se envían automáticamente al recuperar la conexión. Mientras no exista conexión, la aplicación reintenta conectarse con el servidor cada 30 segundos.</w:t>
             </w:r>
           </w:p>
         </w:tc>

</xml_diff>